<commit_message>
Complete PPE reference author lists and missing details
Co-Authored-By: Claude Opus 5.5 <noreply@anthropic.com>
Claude-Session: https://claude.ai/code/session_017cSSzHhwQMgJphnHdZ9H9w
</commit_message>
<xml_diff>
--- a/cpp-placentas/manuscript/Wong_PPE_IH_manuscript.docx
+++ b/cpp-placentas/manuscript/Wong_PPE_IH_manuscript.docx
@@ -2838,7 +2838,7 @@
           <w:sz w:val="24"/>
           <w:szCs w:val="24"/>
         </w:rPr>
-        <w:t xml:space="preserve">1. Sun Y, Zhao J, Meng Y, et al. The prevalence, complications, and risk factors for infantile hemangioma: a systematic review and meta-analysis. International Journal of Dermatology. 2024; 63:737-746. [FLAG: list authors 4 to 6]</w:t>
+        <w:t xml:space="preserve">1. Sun Y, Zhao J, Meng Y, Luo X, Jiang C, Deng G, et al. The prevalence, complications, and risk factors for infantile hemangioma: a systematic review and meta-analysis. International Journal of Dermatology. 2024; 63:737-746. [FLAG: confirm initials of authors 4 to 6]</w:t>
       </w:r>
     </w:p>
     <w:p>
@@ -2866,7 +2866,7 @@
           <w:sz w:val="24"/>
           <w:szCs w:val="24"/>
         </w:rPr>
-        <w:t xml:space="preserve">3. Chang LC, Haggstrom AN, Drolet BA, et al. Growth characteristics of infantile hemangiomas: implications for management. Pediatrics. 2008; 122:360-367. [FLAG: list authors 4 to 6]</w:t>
+        <w:t xml:space="preserve">3. Chang LC, Haggstrom AN, Drolet BA, Baselga E, Chamlin SL, Garzon MC, et al. Growth characteristics of infantile hemangiomas: implications for management. Pediatrics. 2008; 122:360-367.</w:t>
       </w:r>
     </w:p>
     <w:p>
@@ -2908,7 +2908,7 @@
           <w:sz w:val="24"/>
           <w:szCs w:val="24"/>
         </w:rPr>
-        <w:t xml:space="preserve">6. Haggstrom AN, Drolet BA, Baselga E, et al. Prospective study of infantile hemangiomas: demographic, prenatal, and perinatal characteristics. Journal of Pediatrics. 2007; 150:291-294. [FLAG: list authors 4 to 6]</w:t>
+        <w:t xml:space="preserve">6. Haggstrom AN, Drolet BA, Baselga E, Chamlin SL, Garzon MC, Horii KA, et al. Prospective study of infantile hemangiomas: demographic, prenatal, and perinatal characteristics. Journal of Pediatrics. 2007; 150:291-294.</w:t>
       </w:r>
     </w:p>
     <w:p>
@@ -2922,7 +2922,7 @@
           <w:sz w:val="24"/>
           <w:szCs w:val="24"/>
         </w:rPr>
-        <w:t xml:space="preserve">7. Munden A, Butschek R, Tom WL, et al. Prospective study of infantile haemangiomas: incidence, clinical characteristics and association with placental anomalies. British Journal of Dermatology. 2014; 170:907-913. [FLAG: list authors 4 to 6]</w:t>
+        <w:t xml:space="preserve">7. Munden A, Butschek R, Tom WL, Marshall JS, Poeltler DM, Krohne SE, et al. Prospective study of infantile haemangiomas: incidence, clinical characteristics and association with placental anomalies. British Journal of Dermatology. 2014; 170:907-913.</w:t>
       </w:r>
     </w:p>
     <w:p>
@@ -2936,7 +2936,7 @@
           <w:sz w:val="24"/>
           <w:szCs w:val="24"/>
         </w:rPr>
-        <w:t xml:space="preserve">8. Schoch J, Hunjan M, Anderson K, et al. Temporal trends in prenatal risk factors for the development of infantile hemangiomas. Pediatric Dermatology. 2018; 35:787-791. [FLAG: list authors 4 to 6]</w:t>
+        <w:t xml:space="preserve">8. Schoch JJ, Hunjan MK, Anderson KR, Lohse CM, Hand JL, Davis DMR, et al. Temporal trends in prenatal risk factors for the development of infantile hemangiomas. Pediatric Dermatology. 2018; 35:787-791.</w:t>
       </w:r>
     </w:p>
     <w:p>
@@ -2950,7 +2950,7 @@
           <w:sz w:val="24"/>
           <w:szCs w:val="24"/>
         </w:rPr>
-        <w:t xml:space="preserve">9. North PE, Waner M, Mizeracki A, et al. A unique microvascular phenotype shared by juvenile hemangiomas and human placenta. Archives of Dermatology. 2001; 137:559-570. [FLAG: list authors 4 to 6]</w:t>
+        <w:t xml:space="preserve">9. North PE, Waner M, Mizeracki A, Mrak RE, Nicholas R, Kincannon J, et al. A unique microvascular phenotype shared by juvenile hemangiomas and human placenta. Archives of Dermatology. 2001; 137:559-570. [FLAG: confirm initials of authors 4 to 6]</w:t>
       </w:r>
     </w:p>
     <w:p>
@@ -2964,7 +2964,7 @@
           <w:sz w:val="24"/>
           <w:szCs w:val="24"/>
         </w:rPr>
-        <w:t xml:space="preserve">10. Barnés CM, Huang S, Kaipainen A, et al. Evidence by molecular profiling for a placental origin of infantile hemangioma. Proceedings of the National Academy of Sciences of the United States of America. 2005; 102:19097-19102. [FLAG: list authors 4 to 6]</w:t>
+        <w:t xml:space="preserve">10. Barnés CM, Huang S, Kaipainen A, Sanoudou D, Chen EJ, Eichler GS, et al. Evidence by molecular profiling for a placental origin of infantile hemangioma. Proceedings of the National Academy of Sciences of the United States of America. 2005; 102:19097-19102.</w:t>
       </w:r>
     </w:p>
     <w:p>
@@ -2978,7 +2978,7 @@
           <w:sz w:val="24"/>
           <w:szCs w:val="24"/>
         </w:rPr>
-        <w:t xml:space="preserve">11. Kleinman ME, Greives MR, Churgin SS, et al. Hypoxia-induced mediators of stem/progenitor cell trafficking are increased in children with hemangioma. Arteriosclerosis, Thrombosis, and Vascular Biology. 2007; 27:2664-2670. [FLAG: list authors 4 to 6]</w:t>
+        <w:t xml:space="preserve">11. Kleinman ME, Greives MR, Churgin SS, Blechman KM, Chang EI, Ceradini DJ, et al. Hypoxia-induced mediators of stem/progenitor cell trafficking are increased in children with hemangioma. Arteriosclerosis, Thrombosis, and Vascular Biology. 2007; 27:2664-2670.</w:t>
       </w:r>
     </w:p>
     <w:p>
@@ -2992,7 +2992,7 @@
           <w:sz w:val="24"/>
           <w:szCs w:val="24"/>
         </w:rPr>
-        <w:t xml:space="preserve">12. Harbi S, Wang R, Gregory M, et al. Infantile hemangioma originates from a dysregulated but not fully transformed multipotent stem cell. Scientific Reports. 2016; 6:35811. [FLAG: list authors 4 to 6]</w:t>
+        <w:t xml:space="preserve">12. Harbi S, Wang R, Gregory M, Hanson N, Kobylarz K, Ryan K, et al. Infantile hemangioma originates from a dysregulated but not fully transformed multipotent stem cell. Scientific Reports. 2016; 6:35811.</w:t>
       </w:r>
     </w:p>
     <w:p>
@@ -3034,7 +3034,7 @@
           <w:sz w:val="24"/>
           <w:szCs w:val="24"/>
         </w:rPr>
-        <w:t xml:space="preserve">15. Khong TY, Mooney EE, Ariel I, et al. Sampling and definitions of placental lesions: Amsterdam Placental Workshop Group consensus statement. Archives of Pathology and Laboratory Medicine. 2016; 140:698-713. [FLAG: list authors 4 to 6]</w:t>
+        <w:t xml:space="preserve">15. Khong TY, Mooney EE, Ariel I, Balmus NC, Boyd TK, Brundler MA, et al. Sampling and definitions of placental lesions: Amsterdam Placental Workshop Group consensus statement. Archives of Pathology and Laboratory Medicine. 2016; 140:698-713.</w:t>
       </w:r>
     </w:p>
     <w:p>
@@ -3104,7 +3104,7 @@
           <w:sz w:val="24"/>
           <w:szCs w:val="24"/>
         </w:rPr>
-        <w:t xml:space="preserve">20. Redline RW, Faye-Petersen O, Heller D, et al. Amniotic infection syndrome: nosology and reproducibility of placental reaction patterns. Pediatric and Developmental Pathology. 2003; 6:435-448. [FLAG: list authors 4 to 6]</w:t>
+        <w:t xml:space="preserve">20. Redline RW, Faye-Petersen O, Heller D, Qureshi F, Savell V, Vogler C, Society for Pediatric Pathology, Perinatal Section, Amniotic Fluid Infection Nosology Committee. Amniotic infection syndrome: nosology and reproducibility of placental reaction patterns. Pediatric and Developmental Pathology. 2003; 6:435-448.</w:t>
       </w:r>
     </w:p>
     <w:p>
@@ -3118,7 +3118,7 @@
           <w:sz w:val="24"/>
           <w:szCs w:val="24"/>
         </w:rPr>
-        <w:t xml:space="preserve">21. Rocha ML, Menter T, Zekic Tomas S, et al. Reproducibility of the Amsterdam consensus criteria for maternal vascular malperfusion (MVM): a multicenter evaluation of perinatal pathologists. Journal of Perinatal Medicine. 2026; 54:811-815. [FLAG: list authors 4 to 6]</w:t>
+        <w:t xml:space="preserve">21. Rocha ML, Menter T, Zekic Tomas S, Ciolka B, Castro E, Coelho HO, et al. Reproducibility of the Amsterdam consensus criteria for maternal vascular malperfusion (MVM): a multicenter evaluation of perinatal pathologists. Journal of Perinatal Medicine. 2026; 54:811-815.</w:t>
       </w:r>
     </w:p>
     <w:p>
@@ -3132,7 +3132,7 @@
           <w:sz w:val="24"/>
           <w:szCs w:val="24"/>
         </w:rPr>
-        <w:t xml:space="preserve">22. Misra DP, McNally S, Chen Y, Salafia CM. Placental infarcts in the Collaborative Perinatal Project: variable associations infer variable constructs. Placenta. 2020; 99:1-7. [FLAG: confirm author initials]</w:t>
+        <w:t xml:space="preserve">22. Misra DP, McNally S, Chen S, Salafia CM. Placental infarcts in the Collaborative Perinatal Project: variable associations infer variable constructs. Placenta. 2020; 99:1-7.</w:t>
       </w:r>
     </w:p>
     <w:p>
@@ -3174,7 +3174,7 @@
           <w:sz w:val="24"/>
           <w:szCs w:val="24"/>
         </w:rPr>
-        <w:t xml:space="preserve">25. Freedman AA, Miller GE, Franklin AD, et al. Placental pathology and blood pressure at age 7: a longitudinal discordant twin analysis. Arteriosclerosis, Thrombosis, and Vascular Biology. 2025; 45:312-322. [FLAG: list authors 4 to 6]</w:t>
+        <w:t xml:space="preserve">25. Freedman AA, Miller GE, Franklin AD, Keenan-Devlin LS, Gilman SE, Borders A, et al. Placental pathology and blood pressure at age 7: a longitudinal discordant twin analysis. Arteriosclerosis, Thrombosis, and Vascular Biology. 2025; 45:312-322.</w:t>
       </w:r>
     </w:p>
     <w:p>
@@ -3356,7 +3356,7 @@
           <w:sz w:val="24"/>
           <w:szCs w:val="24"/>
         </w:rPr>
-        <w:t xml:space="preserve">38. Freedman AA, et al. Adverse pregnancy outcomes following the assassination of John F. Kennedy in 1963. Maternal and Child Health Journal. 2021. [FLAG: add co-authors, volume, and pages]</w:t>
+        <w:t xml:space="preserve">38. Freedman AA, Miller GE, Keenan-Devlin LS, Smart BP, Romero J, Borders A, et al. Adverse pregnancy outcomes following the assassination of John F. Kennedy in 1963. Maternal and Child Health Journal. 2021; 25:1455-1464.</w:t>
       </w:r>
     </w:p>
     <w:p>
@@ -3384,7 +3384,7 @@
           <w:sz w:val="24"/>
           <w:szCs w:val="24"/>
         </w:rPr>
-        <w:t xml:space="preserve">40. Freedman AA, et al. Patterns of placental pathology associated with preeclampsia. Placenta. 2023. [FLAG: add co-authors, volume, and pages, PMID 37336159]</w:t>
+        <w:t xml:space="preserve">40. Freedman AA, Suresh S, Ernst LM. Patterns of placental pathology associated with preeclampsia. Placenta. 2023; 139:85-91.</w:t>
       </w:r>
     </w:p>
     <w:p>
@@ -3398,7 +3398,7 @@
           <w:sz w:val="24"/>
           <w:szCs w:val="24"/>
         </w:rPr>
-        <w:t xml:space="preserve">41. Wong JJ, Chakraborti Y, Caniglia EC, et al. Association between hypertensive disorders of pregnancy and infantile vascular anomalies in the Collaborative Perinatal Project. AJE Advances: Research in Epidemiology. 2026; 2:uuag016. [FLAG: list authors 4 to 6, confirm journal name]</w:t>
+        <w:t xml:space="preserve">41. Wong JJ, Chakraborti Y, Caniglia EC, Margolis DJ, Schisterman EF, Mumford SL, et al. Association between hypertensive disorders of pregnancy and infantile vascular anomalies in the Collaborative Perinatal Project. AJE Advances: Research in Epidemiology. 2026; 2:uuag016.</w:t>
       </w:r>
     </w:p>
     <w:p>
@@ -3412,7 +3412,7 @@
           <w:sz w:val="24"/>
           <w:szCs w:val="24"/>
         </w:rPr>
-        <w:t xml:space="preserve">42. Auger N, Fraser WD, Arbour L, et al. Pre-eclampsia and risk of infantile haemangioma. British Journal of Dermatology. 2017; 176:371-377. [FLAG: list authors 4 to 6]</w:t>
+        <w:t xml:space="preserve">42. Auger N, Fraser WD, Arbour L, Healy-Profitós J, Drolet BA. Pre-eclampsia and risk of infantile haemangioma. British Journal of Dermatology. 2017; 176:371-377.</w:t>
       </w:r>
     </w:p>
     <w:p>
@@ -3426,7 +3426,7 @@
           <w:sz w:val="24"/>
           <w:szCs w:val="24"/>
         </w:rPr>
-        <w:t xml:space="preserve">43. Baker BC, Heazell AEP, Sibley C, et al. Hypoxia and oxidative stress induce sterile placental inflammation in vitro. Scientific Reports. 2021; 11. [FLAG: list authors 4 to 6, add article number]</w:t>
+        <w:t xml:space="preserve">43. Baker BC, Heazell AEP, Sibley C, Wright R, Bischof H, Beards F, et al. Hypoxia and oxidative stress induce sterile placental inflammation in vitro. Scientific Reports. 2021; 11:7281.</w:t>
       </w:r>
     </w:p>
     <w:p>
@@ -3440,7 +3440,7 @@
           <w:sz w:val="24"/>
           <w:szCs w:val="24"/>
         </w:rPr>
-        <w:t xml:space="preserve">44. Gotsch F, Romero R, Kusanovic JP, et al. The fetal inflammatory response syndrome. Clinical Obstetrics and Gynecology. 2007; 50:652-683. [FLAG: list authors 4 to 6]</w:t>
+        <w:t xml:space="preserve">44. Gotsch F, Romero R, Kusanovic JP, Mazaki-Tovi S, Pineles BL, Erez O, et al. The fetal inflammatory response syndrome. Clinical Obstetrics and Gynecology. 2007; 50:652-683.</w:t>
       </w:r>
     </w:p>
     <w:p>

</xml_diff>

<commit_message>
PPE abstract: revise Background
Co-Authored-By: Claude Opus 5.5 <noreply@anthropic.com>
Claude-Session: https://claude.ai/code/session_017cSSzHhwQMgJphnHdZ9H9w
</commit_message>
<xml_diff>
--- a/cpp-placentas/manuscript/Wong_PPE_IH_manuscript.docx
+++ b/cpp-placentas/manuscript/Wong_PPE_IH_manuscript.docx
@@ -508,7 +508,7 @@
           <w:sz w:val="24"/>
           <w:szCs w:val="24"/>
         </w:rPr>
-        <w:t xml:space="preserve">2,997 (main text), 262 (abstract)</w:t>
+        <w:t xml:space="preserve">2,997 (main text), 274 (abstract)</w:t>
       </w:r>
     </w:p>
     <w:p>
@@ -577,7 +577,7 @@
           <w:sz w:val="24"/>
           <w:szCs w:val="24"/>
         </w:rPr>
-        <w:t xml:space="preserve">Infantile haemangioma (IH), the most common tumour of infancy, shares a distinctive molecular phenotype with the placenta, and perinatal risk factors implicate the maternal-placental-foetal unit. Associations with patterns of placental injury have not been examined in a large cohort.</w:t>
+        <w:t xml:space="preserve">Infantile haemangioma (IH), the most common tumour of infancy, shares a distinctive molecular phenotype with the placenta, yet its developmental origins remain poorly understood. Perinatal risk factors linked to placental dysfunction (e.g., placenta praevia and pre-eclampsia) invite investigation of histopathological patterns of placental injury, whose associations with IH remain largely unexamined.</w:t>
       </w:r>
     </w:p>
     <w:p>

</xml_diff>

<commit_message>
PPE abstract: drop gap clause from Background
Co-Authored-By: Claude Opus 5.5 <noreply@anthropic.com>
Claude-Session: https://claude.ai/code/session_017cSSzHhwQMgJphnHdZ9H9w
</commit_message>
<xml_diff>
--- a/cpp-placentas/manuscript/Wong_PPE_IH_manuscript.docx
+++ b/cpp-placentas/manuscript/Wong_PPE_IH_manuscript.docx
@@ -508,7 +508,7 @@
           <w:sz w:val="24"/>
           <w:szCs w:val="24"/>
         </w:rPr>
-        <w:t xml:space="preserve">2,997 (main text), 274 (abstract)</w:t>
+        <w:t xml:space="preserve">2,997 (main text), 267 (abstract)</w:t>
       </w:r>
     </w:p>
     <w:p>
@@ -577,7 +577,7 @@
           <w:sz w:val="24"/>
           <w:szCs w:val="24"/>
         </w:rPr>
-        <w:t xml:space="preserve">Infantile haemangioma (IH), the most common tumour of infancy, shares a distinctive molecular phenotype with the placenta, yet its developmental origins remain poorly understood. Perinatal risk factors linked to placental dysfunction (e.g., placenta praevia and pre-eclampsia) invite investigation of histopathological patterns of placental injury, whose associations with IH remain largely unexamined.</w:t>
+        <w:t xml:space="preserve">Infantile haemangioma (IH), the most common tumour of infancy, shares a distinctive molecular phenotype with the placenta, yet its developmental origins remain poorly understood. Perinatal risk factors linked to placental dysfunction (e.g., placenta praevia and pre-eclampsia) invite investigation of histopathological patterns of placental injury.</w:t>
       </w:r>
     </w:p>
     <w:p>

</xml_diff>

<commit_message>
PPE abstract: frame clinical placental conditions as inconsistent
Co-Authored-By: Claude Opus 5.5 <noreply@anthropic.com>
Claude-Session: https://claude.ai/code/session_017cSSzHhwQMgJphnHdZ9H9w
</commit_message>
<xml_diff>
--- a/cpp-placentas/manuscript/Wong_PPE_IH_manuscript.docx
+++ b/cpp-placentas/manuscript/Wong_PPE_IH_manuscript.docx
@@ -508,7 +508,7 @@
           <w:sz w:val="24"/>
           <w:szCs w:val="24"/>
         </w:rPr>
-        <w:t xml:space="preserve">2,997 (main text), 267 (abstract)</w:t>
+        <w:t xml:space="preserve">2,997 (main text), 271 (abstract)</w:t>
       </w:r>
     </w:p>
     <w:p>
@@ -577,7 +577,7 @@
           <w:sz w:val="24"/>
           <w:szCs w:val="24"/>
         </w:rPr>
-        <w:t xml:space="preserve">Infantile haemangioma (IH), the most common tumour of infancy, shares a distinctive molecular phenotype with the placenta, yet its developmental origins remain poorly understood. Perinatal risk factors linked to placental dysfunction (e.g., placenta praevia and pre-eclampsia) invite investigation of histopathological patterns of placental injury.</w:t>
+        <w:t xml:space="preserve">Infantile haemangioma (IH), the most common tumour of infancy, shares a distinctive molecular phenotype with the placenta, yet its developmental origins remain poorly understood. Associations of IH with clinically defined placental conditions (e.g., placenta praevia and pre-eclampsia) have been inconsistent, inviting investigation of histopathological patterns of placental injury.</w:t>
       </w:r>
     </w:p>
     <w:p>

</xml_diff>

<commit_message>
PPE abstract: histopathology to characterise underlying placental injury
Co-Authored-By: Claude Opus 5.5 <noreply@anthropic.com>
Claude-Session: https://claude.ai/code/session_017cSSzHhwQMgJphnHdZ9H9w
</commit_message>
<xml_diff>
--- a/cpp-placentas/manuscript/Wong_PPE_IH_manuscript.docx
+++ b/cpp-placentas/manuscript/Wong_PPE_IH_manuscript.docx
@@ -508,7 +508,7 @@
           <w:sz w:val="24"/>
           <w:szCs w:val="24"/>
         </w:rPr>
-        <w:t xml:space="preserve">2,997 (main text), 271 (abstract)</w:t>
+        <w:t xml:space="preserve">2,997 (main text), 274 (abstract)</w:t>
       </w:r>
     </w:p>
     <w:p>
@@ -577,7 +577,7 @@
           <w:sz w:val="24"/>
           <w:szCs w:val="24"/>
         </w:rPr>
-        <w:t xml:space="preserve">Infantile haemangioma (IH), the most common tumour of infancy, shares a distinctive molecular phenotype with the placenta, yet its developmental origins remain poorly understood. Associations of IH with clinically defined placental conditions (e.g., placenta praevia and pre-eclampsia) have been inconsistent, inviting investigation of histopathological patterns of placental injury.</w:t>
+        <w:t xml:space="preserve">Infantile haemangioma (IH), the most common tumour of infancy, shares a distinctive molecular phenotype with the placenta, yet its developmental origins remain poorly understood. Associations of IH with clinically defined placental conditions (e.g., placenta praevia and pre-eclampsia) have been inconsistent, inviting the use of histopathology to characterise the underlying placental injury.</w:t>
       </w:r>
     </w:p>
     <w:p>

</xml_diff>

<commit_message>
PPE abstract: split Background into separate sentences
Co-Authored-By: Claude Opus 5.5 <noreply@anthropic.com>
Claude-Session: https://claude.ai/code/session_017cSSzHhwQMgJphnHdZ9H9w
</commit_message>
<xml_diff>
--- a/cpp-placentas/manuscript/Wong_PPE_IH_manuscript.docx
+++ b/cpp-placentas/manuscript/Wong_PPE_IH_manuscript.docx
@@ -508,7 +508,7 @@
           <w:sz w:val="24"/>
           <w:szCs w:val="24"/>
         </w:rPr>
-        <w:t xml:space="preserve">2,997 (main text), 274 (abstract)</w:t>
+        <w:t xml:space="preserve">2,997 (main text), 276 (abstract)</w:t>
       </w:r>
     </w:p>
     <w:p>
@@ -577,7 +577,7 @@
           <w:sz w:val="24"/>
           <w:szCs w:val="24"/>
         </w:rPr>
-        <w:t xml:space="preserve">Infantile haemangioma (IH), the most common tumour of infancy, shares a distinctive molecular phenotype with the placenta, yet its developmental origins remain poorly understood. Associations of IH with clinically defined placental conditions (e.g., placenta praevia and pre-eclampsia) have been inconsistent, inviting the use of histopathology to characterise the underlying placental injury.</w:t>
+        <w:t xml:space="preserve">Infantile haemangioma (IH), the most common tumour of infancy, shares a distinctive molecular phenotype with the placenta, yet its developmental origins remain poorly understood. Associations of IH with clinically defined placental conditions (e.g., placenta praevia and pre-eclampsia) have been inconsistent. This inconsistency invites the use of histopathology to characterise the underlying placental injury.</w:t>
       </w:r>
     </w:p>
     <w:p>

</xml_diff>

<commit_message>
PPE abstract: refine Background wording
Co-Authored-By: Claude Opus 5.5 <noreply@anthropic.com>
Claude-Session: https://claude.ai/code/session_017cSSzHhwQMgJphnHdZ9H9w
</commit_message>
<xml_diff>
--- a/cpp-placentas/manuscript/Wong_PPE_IH_manuscript.docx
+++ b/cpp-placentas/manuscript/Wong_PPE_IH_manuscript.docx
@@ -508,7 +508,7 @@
           <w:sz w:val="24"/>
           <w:szCs w:val="24"/>
         </w:rPr>
-        <w:t xml:space="preserve">2,997 (main text), 276 (abstract)</w:t>
+        <w:t xml:space="preserve">2,997 (main text), 280 (abstract)</w:t>
       </w:r>
     </w:p>
     <w:p>
@@ -577,7 +577,7 @@
           <w:sz w:val="24"/>
           <w:szCs w:val="24"/>
         </w:rPr>
-        <w:t xml:space="preserve">Infantile haemangioma (IH), the most common tumour of infancy, shares a distinctive molecular phenotype with the placenta, yet its developmental origins remain poorly understood. Associations of IH with clinically defined placental conditions (e.g., placenta praevia and pre-eclampsia) have been inconsistent. This inconsistency invites the use of histopathology to characterise the underlying placental injury.</w:t>
+        <w:t xml:space="preserve">Infantile haemangioma (IH), the most common tumour of infancy, shares a distinctive molecular phenotype with the placenta, yet its developmental origins remain poorly understood. Associations between clinically defined placental conditions (e.g., placenta praevia and pre-eclampsia) and IH development have been inconsistent. This highlights the need to characterise the underlying patterns of placental injury in relation to IH.</w:t>
       </w:r>
     </w:p>
     <w:p>

</xml_diff>

<commit_message>
PPE abstract: upstream placental injury framing in Background
Co-Authored-By: Claude Opus 5.5 <noreply@anthropic.com>
Claude-Session: https://claude.ai/code/session_017cSSzHhwQMgJphnHdZ9H9w
</commit_message>
<xml_diff>
--- a/cpp-placentas/manuscript/Wong_PPE_IH_manuscript.docx
+++ b/cpp-placentas/manuscript/Wong_PPE_IH_manuscript.docx
@@ -508,7 +508,7 @@
           <w:sz w:val="24"/>
           <w:szCs w:val="24"/>
         </w:rPr>
-        <w:t xml:space="preserve">2,997 (main text), 280 (abstract)</w:t>
+        <w:t xml:space="preserve">2,997 (main text), 275 (abstract)</w:t>
       </w:r>
     </w:p>
     <w:p>
@@ -577,7 +577,7 @@
           <w:sz w:val="24"/>
           <w:szCs w:val="24"/>
         </w:rPr>
-        <w:t xml:space="preserve">Infantile haemangioma (IH), the most common tumour of infancy, shares a distinctive molecular phenotype with the placenta, yet its developmental origins remain poorly understood. Associations between clinically defined placental conditions (e.g., placenta praevia and pre-eclampsia) and IH development have been inconsistent. This highlights the need to characterise the underlying patterns of placental injury in relation to IH.</w:t>
+        <w:t xml:space="preserve">Infantile haemangioma (IH), the most common tumour of infancy, shares a distinctive molecular phenotype with the placenta, yet its developmental origins remain poorly understood. Associations between clinical conditions of placental origin (e.g., pre-eclampsia and foetal growth restriction) and IH development have been inconsistent, warranting investigation of the upstream patterns of placental injury.</w:t>
       </w:r>
     </w:p>
     <w:p>

</xml_diff>

<commit_message>
PPE abstract: final Background wording
Co-Authored-By: Claude Opus 5.5 <noreply@anthropic.com>
Claude-Session: https://claude.ai/code/session_017cSSzHhwQMgJphnHdZ9H9w
</commit_message>
<xml_diff>
--- a/cpp-placentas/manuscript/Wong_PPE_IH_manuscript.docx
+++ b/cpp-placentas/manuscript/Wong_PPE_IH_manuscript.docx
@@ -508,7 +508,7 @@
           <w:sz w:val="24"/>
           <w:szCs w:val="24"/>
         </w:rPr>
-        <w:t xml:space="preserve">2,997 (main text), 275 (abstract)</w:t>
+        <w:t xml:space="preserve">2,997 (main text), 281 (abstract)</w:t>
       </w:r>
     </w:p>
     <w:p>
@@ -577,7 +577,7 @@
           <w:sz w:val="24"/>
           <w:szCs w:val="24"/>
         </w:rPr>
-        <w:t xml:space="preserve">Infantile haemangioma (IH), the most common tumour of infancy, shares a distinctive molecular phenotype with the placenta, yet its developmental origins remain poorly understood. Associations between clinical conditions of placental origin (e.g., pre-eclampsia and foetal growth restriction) and IH development have been inconsistent, warranting investigation of the upstream patterns of placental injury.</w:t>
+        <w:t xml:space="preserve">Infantile haemangioma (IH), the most common tumour of infancy, shares a distinctive molecular phenotype with the placenta, yet its developmental origins remain poorly understood. Clinical conditions of placental origin (e.g., pre-eclampsia and foetal growth restriction) have pointed towards a placental contribution, but their associations with IH have been inconsistent, warranting investigation of the upstream patterns of placental injury.</w:t>
       </w:r>
     </w:p>
     <w:p>

</xml_diff>

<commit_message>
PPE abstract: Objectives as (a) MVM, (b) AI, (c) co-occurring
Co-Authored-By: Claude Opus 5.5 <noreply@anthropic.com>
Claude-Session: https://claude.ai/code/session_017cSSzHhwQMgJphnHdZ9H9w
</commit_message>
<xml_diff>
--- a/cpp-placentas/manuscript/Wong_PPE_IH_manuscript.docx
+++ b/cpp-placentas/manuscript/Wong_PPE_IH_manuscript.docx
@@ -508,7 +508,7 @@
           <w:sz w:val="24"/>
           <w:szCs w:val="24"/>
         </w:rPr>
-        <w:t xml:space="preserve">2,997 (main text), 281 (abstract)</w:t>
+        <w:t xml:space="preserve">2,997 (main text), 292 (abstract)</w:t>
       </w:r>
     </w:p>
     <w:p>
@@ -600,7 +600,7 @@
           <w:sz w:val="24"/>
           <w:szCs w:val="24"/>
         </w:rPr>
-        <w:t xml:space="preserve">To examine associations of placental maternal vascular malperfusion (MVM) and acute inflammation (AI), separately and jointly, with IH.</w:t>
+        <w:t xml:space="preserve">To examine associations of (a) maternal vascular malperfusion (MVM), (b) acute inflammation (AI), and (c) co-occurring MVM and AI with the development of IH by 12 months of age.</w:t>
       </w:r>
     </w:p>
     <w:p>

</xml_diff>

<commit_message>
PPE abstract: parallel Methods
Co-Authored-By: Claude Opus 5.5 <noreply@anthropic.com>
Claude-Session: https://claude.ai/code/session_017cSSzHhwQMgJphnHdZ9H9w
</commit_message>
<xml_diff>
--- a/cpp-placentas/manuscript/Wong_PPE_IH_manuscript.docx
+++ b/cpp-placentas/manuscript/Wong_PPE_IH_manuscript.docx
@@ -508,7 +508,7 @@
           <w:sz w:val="24"/>
           <w:szCs w:val="24"/>
         </w:rPr>
-        <w:t xml:space="preserve">2,997 (main text), 292 (abstract)</w:t>
+        <w:t xml:space="preserve">2,997 (main text), 301 (abstract)</w:t>
       </w:r>
     </w:p>
     <w:p>
@@ -623,7 +623,7 @@
           <w:sz w:val="24"/>
           <w:szCs w:val="24"/>
         </w:rPr>
-        <w:t xml:space="preserve">This prospective cohort included 45,268 singleton pregnancies enrolled from 1959 to 1965 at 12 US centres of the Collaborative Perinatal Project, with standardised placental histopathology. Exposures were MVM and AI, each as present or absent and as a score, and their joint occurrence (neither, MVM only, AI only, or both). Study paediatricians ascertained IH at 12 months. Relative risks (RR) were estimated with modified Poisson regression adjusted for 11 covariates and study site, with inverse probability of censoring weights and multiple imputation.</w:t>
+        <w:t xml:space="preserve">This prospective cohort study used data from the Collaborative Perinatal Project (12 US centres, enrolment 1959 to 1965). Exposures were placental MVM and AI, each as present or absent and as a score, and their co-occurrence (neither, MVM only, AI only, or both). The outcome was IH, ascertained by study paediatricians at 12 months. Adjusted relative risks (aRR) were estimated with modified Poisson regression, with adjustment for 11 covariates and study site, inverse probability of censoring weights for survival to and examination at 12 months, and multiple imputation for missing covariates.</w:t>
       </w:r>
     </w:p>
     <w:p>

</xml_diff>

<commit_message>
PPE abstract: trim Methods under 300 words
Co-Authored-By: Claude Opus 5.5 <noreply@anthropic.com>
Claude-Session: https://claude.ai/code/session_017cSSzHhwQMgJphnHdZ9H9w
</commit_message>
<xml_diff>
--- a/cpp-placentas/manuscript/Wong_PPE_IH_manuscript.docx
+++ b/cpp-placentas/manuscript/Wong_PPE_IH_manuscript.docx
@@ -508,7 +508,7 @@
           <w:sz w:val="24"/>
           <w:szCs w:val="24"/>
         </w:rPr>
-        <w:t xml:space="preserve">2,997 (main text), 301 (abstract)</w:t>
+        <w:t xml:space="preserve">2,997 (main text), 299 (abstract)</w:t>
       </w:r>
     </w:p>
     <w:p>
@@ -623,7 +623,7 @@
           <w:sz w:val="24"/>
           <w:szCs w:val="24"/>
         </w:rPr>
-        <w:t xml:space="preserve">This prospective cohort study used data from the Collaborative Perinatal Project (12 US centres, enrolment 1959 to 1965). Exposures were placental MVM and AI, each as present or absent and as a score, and their co-occurrence (neither, MVM only, AI only, or both). The outcome was IH, ascertained by study paediatricians at 12 months. Adjusted relative risks (aRR) were estimated with modified Poisson regression, with adjustment for 11 covariates and study site, inverse probability of censoring weights for survival to and examination at 12 months, and multiple imputation for missing covariates.</w:t>
+        <w:t xml:space="preserve">This prospective cohort study used data from the Collaborative Perinatal Project (12 US centres, enrolment 1959 to 1965). Exposures were placental MVM and AI, each as binary and as a score, and their co-occurrence (neither, MVM only, AI only, or both). The outcome was IH, ascertained by study paediatricians at 12 months. Adjusted relative risks (aRR) were estimated with modified Poisson regression, with adjustment for 11 covariates and study site, inverse probability of censoring weights for survival to and examination at 12 months, and multiple imputation for missing covariates.</w:t>
       </w:r>
     </w:p>
     <w:p>

</xml_diff>

<commit_message>
PPE abstract: Objectives as a full sentence
Co-Authored-By: Claude Opus 5.5 <noreply@anthropic.com>
Claude-Session: https://claude.ai/code/session_017cSSzHhwQMgJphnHdZ9H9w
</commit_message>
<xml_diff>
--- a/cpp-placentas/manuscript/Wong_PPE_IH_manuscript.docx
+++ b/cpp-placentas/manuscript/Wong_PPE_IH_manuscript.docx
@@ -508,7 +508,7 @@
           <w:sz w:val="24"/>
           <w:szCs w:val="24"/>
         </w:rPr>
-        <w:t xml:space="preserve">2,997 (main text), 299 (abstract)</w:t>
+        <w:t xml:space="preserve">2,997 (main text), 300 (abstract)</w:t>
       </w:r>
     </w:p>
     <w:p>
@@ -600,7 +600,7 @@
           <w:sz w:val="24"/>
           <w:szCs w:val="24"/>
         </w:rPr>
-        <w:t xml:space="preserve">To examine associations of (a) maternal vascular malperfusion (MVM), (b) acute inflammation (AI), and (c) co-occurring MVM and AI with the development of IH by 12 months of age.</w:t>
+        <w:t xml:space="preserve">This study examined associations of (a) maternal vascular malperfusion (MVM), (b) acute inflammation (AI), and (c) co-occurring MVM and AI with the development of IH by 12 months of age.</w:t>
       </w:r>
     </w:p>
     <w:p>

</xml_diff>

<commit_message>
PPE abstract: name placental histopathology in Objectives
Co-Authored-By: Claude Opus 5.5 <noreply@anthropic.com>
Claude-Session: https://claude.ai/code/session_017cSSzHhwQMgJphnHdZ9H9w
</commit_message>
<xml_diff>
--- a/cpp-placentas/manuscript/Wong_PPE_IH_manuscript.docx
+++ b/cpp-placentas/manuscript/Wong_PPE_IH_manuscript.docx
@@ -508,7 +508,7 @@
           <w:sz w:val="24"/>
           <w:szCs w:val="24"/>
         </w:rPr>
-        <w:t xml:space="preserve">2,997 (main text), 300 (abstract)</w:t>
+        <w:t xml:space="preserve">2,997 (main text), 303 (abstract)</w:t>
       </w:r>
     </w:p>
     <w:p>
@@ -600,7 +600,7 @@
           <w:sz w:val="24"/>
           <w:szCs w:val="24"/>
         </w:rPr>
-        <w:t xml:space="preserve">To examine the associations of (a) maternal vascular malperfusion (MVM), (b) acute inflammation (AI), and (c) co-occurring MVM and AI with the development of IH by 12 months of age.</w:t>
+        <w:t xml:space="preserve">To examine the associations of placental histopathology, specifically (a) maternal vascular malperfusion (MVM), (b) acute inflammation (AI), and (c) co-occurring MVM and AI, with the development of IH by 12 months of age.</w:t>
       </w:r>
     </w:p>
     <w:p>

</xml_diff>

<commit_message>
PPE abstract: injury patterns in Objectives, histopathology in Methods
Co-Authored-By: Claude Opus 5.5 <noreply@anthropic.com>
Claude-Session: https://claude.ai/code/session_017cSSzHhwQMgJphnHdZ9H9w
</commit_message>
<xml_diff>
--- a/cpp-placentas/manuscript/Wong_PPE_IH_manuscript.docx
+++ b/cpp-placentas/manuscript/Wong_PPE_IH_manuscript.docx
@@ -508,7 +508,7 @@
           <w:sz w:val="24"/>
           <w:szCs w:val="24"/>
         </w:rPr>
-        <w:t xml:space="preserve">2,997 (main text), 303 (abstract)</w:t>
+        <w:t xml:space="preserve">2,997 (main text), 300 (abstract)</w:t>
       </w:r>
     </w:p>
     <w:p>
@@ -600,7 +600,7 @@
           <w:sz w:val="24"/>
           <w:szCs w:val="24"/>
         </w:rPr>
-        <w:t xml:space="preserve">To examine the associations of placental histopathology, specifically (a) maternal vascular malperfusion (MVM), (b) acute inflammation (AI), and (c) co-occurring MVM and AI, with the development of IH by 12 months of age.</w:t>
+        <w:t xml:space="preserve">To examine the associations of placental injury patterns, specifically (a) maternal vascular malperfusion (MVM), (b) acute inflammation (AI), and (c) co-occurring MVM and AI, with the development of IH by 12 months of age.</w:t>
       </w:r>
     </w:p>
     <w:p>
@@ -623,7 +623,7 @@
           <w:sz w:val="24"/>
           <w:szCs w:val="24"/>
         </w:rPr>
-        <w:t xml:space="preserve">This prospective cohort study used data from the Collaborative Perinatal Project (12 US centres, enrolment 1959 to 1965). Exposures were placental MVM and AI, each as binary and as a score, and their co-occurrence (neither, MVM only, AI only, or both). The outcome was IH, ascertained by study paediatricians at 12 months. Adjusted relative risks (aRR) were estimated with modified Poisson regression, with adjustment for 11 covariates and study site, inverse probability of censoring weights for survival to and examination at 12 months, and multiple imputation for missing covariates.</w:t>
+        <w:t xml:space="preserve">Using data from the Collaborative Perinatal Project (1959-1966), a prospective cohort across 12 US centres, this analysis included 45,268 singleton pregnancies. Exposures were MVM and AI on placental histopathology, each classified as binary and as a score, and their co-occurrence. The outcome was IH, ascertained by study paediatricians at 12 months. Adjusted relative risks (aRR) were estimated using modified Poisson regression, adjusting for 11 covariates and study site for confounding, with inverse probability of censoring weights for selection bias and multiple imputation for missing covariates.</w:t>
       </w:r>
     </w:p>
     <w:p>
@@ -646,7 +646,7 @@
           <w:sz w:val="24"/>
           <w:szCs w:val="24"/>
         </w:rPr>
-        <w:t xml:space="preserve">Of 45,268 placentas, 29.0% showed MVM, 22.5% showed AI, and 7.9% showed both. Of 40,700 infants examined at 12 months, 1.7% (700) had IH. IH risk was 2.4% when placentas showed both MVM and AI and 1.6% when they showed neither (RR 1.37, 95% confidence interval [CI] 1.05, 1.79, E-value 2.08). IH risk was 2.0% with and 1.6% without MVM (RR 1.14, 95% CI 0.96, 1.35), and 2.0% with and 1.6% without AI (RR 1.14, 95% CI 0.96, 1.35).</w:t>
+        <w:t xml:space="preserve">Overall, 29.0% of placentas showed MVM, 22.5% showed AI, and 7.9% showed both. Of 40,700 infants examined at 12 months, 1.7% (700) had IH. IH risk was 2.4% when placentas showed both MVM and AI and 1.6% when they showed neither (RR 1.37, 95% confidence interval [CI] 1.05, 1.79, E-value 2.08). IH risk was 2.0% with and 1.6% without MVM (RR 1.14, 95% CI 0.96, 1.35), and 2.0% with and 1.6% without AI (RR 1.14, 95% CI 0.96, 1.35).</w:t>
       </w:r>
     </w:p>
     <w:p>

</xml_diff>